<commit_message>
docs(sipes): palavras-chave DeCS confirmadas
Saneamento [D012499]; Alocação de Recursos [D040841]; Gastos em Saúde
[D005102]. Atualiza o projeto (identificação, strings de busca, checklist),
o esboço do banner (linha de palavras-chave) e o README.
</commit_message>
<xml_diff>
--- a/docs/sipes-2026/esboco-banner-sipes-2026.docx
+++ b/docs/sipes-2026/esboco-banner-sipes-2026.docx
@@ -207,7 +207,7 @@
     </w:p>
     <w:p>
       <w:pPr>
-        <w:spacing w:after="120" w:before="0" w:line="269" w:lineRule="auto"/>
+        <w:spacing w:after="40" w:before="0" w:line="269" w:lineRule="auto"/>
         <w:jc w:val="center"/>
       </w:pPr>
       <w:r>
@@ -219,6 +219,32 @@
           <w:sz w:val="17"/>
         </w:rPr>
         <w:t>¹Instituição, cidade/UF · ²Instituição · e-mail do autor apresentador</w:t>
+      </w:r>
+    </w:p>
+    <w:p>
+      <w:pPr>
+        <w:spacing w:after="120" w:before="0" w:line="269" w:lineRule="auto"/>
+        <w:jc w:val="center"/>
+      </w:pPr>
+      <w:r>
+        <w:rPr>
+          <w:rFonts w:ascii="Calibri" w:hAnsi="Calibri"/>
+          <w:b/>
+          <w:i w:val="0"/>
+          <w:color w:val="5A6270"/>
+          <w:sz w:val="18"/>
+        </w:rPr>
+        <w:t xml:space="preserve">Palavras-chave (DeCS): </w:t>
+      </w:r>
+      <w:r>
+        <w:rPr>
+          <w:rFonts w:ascii="Calibri" w:hAnsi="Calibri"/>
+          <w:b w:val="0"/>
+          <w:i w:val="0"/>
+          <w:color w:val="5A6270"/>
+          <w:sz w:val="18"/>
+        </w:rPr>
+        <w:t>Saneamento; Alocação de Recursos; Gastos em Saúde</w:t>
       </w:r>
     </w:p>
     <w:tbl>

</xml_diff>